<commit_message>
CV navy template: add r:embed placeholder to empty blip elements so photo injection works
</commit_message>
<xml_diff>
--- a/backend/templates/cv_job_navy_placeholders.docx
+++ b/backend/templates/cv_job_navy_placeholders.docx
@@ -197,7 +197,7 @@
                           </pic:cNvPicPr>
                         </pic:nvPicPr>
                         <pic:blipFill>
-                          <a:blip/>
+                          <a:blip r:embed="rId_employee_photo"/>
                           <a:stretch>
                             <a:fillRect/>
                           </a:stretch>
@@ -254,7 +254,7 @@
                           </pic:cNvPicPr>
                         </pic:nvPicPr>
                         <pic:blipFill>
-                          <a:blip/>
+                          <a:blip r:embed="rId_employee_photo"/>
                           <a:stretch>
                             <a:fillRect/>
                           </a:stretch>

</xml_diff>

<commit_message>
CV navy template: remove right duplicate photo, align left photo flush with employee name
</commit_message>
<xml_diff>
--- a/backend/templates/cv_job_navy_placeholders.docx
+++ b/backend/templates/cv_job_navy_placeholders.docx
@@ -166,16 +166,6 @@
               </w:rPr>
             </w:pPr>
             <w:r>
-              <w:t xml:space="preserve"> </w:t>
-            </w:r>
-            <w:r>
-              <w:rPr>
-                <w:noProof/>
-                <w:lang w:val="en-AU" w:eastAsia="en-AU"/>
-              </w:rPr>
-              <w:t xml:space="preserve"> </w:t>
-            </w:r>
-            <w:r>
               <w:rPr>
                 <w:noProof/>
               </w:rPr>
@@ -232,48 +222,6 @@
                 <w:lang w:val="en-AU" w:eastAsia="en-AU"/>
               </w:rPr>
             </w:pPr>
-            <w:r>
-              <w:rPr>
-                <w:noProof/>
-              </w:rPr>
-              <w:drawing>
-                <wp:inline distT="0" distB="0" distL="0" distR="0" wp14:anchorId="3F1AA17A" wp14:editId="7BB19976">
-                  <wp:extent cx="1152000" cy="1440000"/>
-                  <wp:effectExtent l="0" t="0" r="0" b="0"/>
-                  <wp:docPr id="1182144863" name="EmployeePhoto"/>
-                  <wp:cNvGraphicFramePr>
-                    <a:graphicFrameLocks xmlns:a="http://schemas.openxmlformats.org/drawingml/2006/main" noChangeAspect="1"/>
-                  </wp:cNvGraphicFramePr>
-                  <a:graphic xmlns:a="http://schemas.openxmlformats.org/drawingml/2006/main">
-                    <a:graphicData uri="http://schemas.openxmlformats.org/drawingml/2006/picture">
-                      <pic:pic xmlns:pic="http://schemas.openxmlformats.org/drawingml/2006/picture">
-                        <pic:nvPicPr>
-                          <pic:cNvPr id="0" name="EmployeePhoto"/>
-                          <pic:cNvPicPr>
-                            <a:picLocks noChangeAspect="1"/>
-                          </pic:cNvPicPr>
-                        </pic:nvPicPr>
-                        <pic:blipFill>
-                          <a:blip r:embed="rId_employee_photo"/>
-                          <a:stretch>
-                            <a:fillRect/>
-                          </a:stretch>
-                        </pic:blipFill>
-                        <pic:spPr>
-                          <a:xfrm>
-                            <a:off x="0" y="0"/>
-                            <a:ext cx="1152000" cy="1440000"/>
-                          </a:xfrm>
-                          <a:prstGeom prst="rect">
-                            <a:avLst/>
-                          </a:prstGeom>
-                        </pic:spPr>
-                      </pic:pic>
-                    </a:graphicData>
-                  </a:graphic>
-                </wp:inline>
-              </w:drawing>
-            </w:r>
           </w:p>
         </w:tc>
       </w:tr>

</xml_diff>

<commit_message>
CV navy template: add Greek field labels in ΕΠΙΚΟΙΝΩΝΙΑ, remove website placeholder
</commit_message>
<xml_diff>
--- a/backend/templates/cv_job_navy_placeholders.docx
+++ b/backend/templates/cv_job_navy_placeholders.docx
@@ -358,7 +358,7 @@
               </w:sdtPr>
               <w:sdtContent>
                 <w:r>
-                  <w:t>{homeAddress}</w:t>
+                  <w:t xml:space="preserve">Διεύθυνση: {homeAddress}</w:t>
                 </w:r>
               </w:sdtContent>
             </w:sdt>
@@ -368,7 +368,7 @@
               <w:pStyle w:val="Heading2"/>
             </w:pPr>
             <w:r>
-              <w:t>{dateOfBirth}</w:t>
+              <w:t xml:space="preserve">Ημ. Γέννησης: {dateOfBirth}</w:t>
             </w:r>
           </w:p>
           <w:p>
@@ -376,7 +376,7 @@
               <w:pStyle w:val="Heading2"/>
             </w:pPr>
             <w:r>
-              <w:t>{placeOfBirth}</w:t>
+              <w:t xml:space="preserve">Τόπος Γέννησης: {placeOfBirth}</w:t>
             </w:r>
           </w:p>
           <w:p>
@@ -426,7 +426,7 @@
               </w:sdtPr>
               <w:sdtContent>
                 <w:r>
-                  <w:t>{phone}</w:t>
+                  <w:t xml:space="preserve">Τηλέφωνο: {phone}</w:t>
                 </w:r>
               </w:sdtContent>
             </w:sdt>
@@ -444,25 +444,7 @@
               </w:sdtPr>
               <w:sdtContent>
                 <w:r>
-                  <w:t>{email}</w:t>
-                </w:r>
-              </w:sdtContent>
-            </w:sdt>
-          </w:p>
-          <w:p>
-            <w:sdt>
-              <w:sdtPr>
-                <w:id w:val="532158479"/>
-                <w:placeholder>
-                  <w:docPart w:val="37A6B0DDB5AF45A0B91FF67CB5C71045"/>
-                </w:placeholder>
-                <w:temporary/>
-                <w:showingPlcHdr/>
-                <w15:appearance w15:val="hidden"/>
-              </w:sdtPr>
-              <w:sdtContent>
-                <w:r>
-                  <w:t>{website}</w:t>
+                  <w:t xml:space="preserve">Email: {email}</w:t>
                 </w:r>
               </w:sdtContent>
             </w:sdt>

</xml_diff>

<commit_message>
CV navy template: add degreeType field to ΕΚΠΑΙΔΕΥΣΗ section
</commit_message>
<xml_diff>
--- a/backend/templates/cv_job_navy_placeholders.docx
+++ b/backend/templates/cv_job_navy_placeholders.docx
@@ -618,6 +618,21 @@
                 <w:lang w:eastAsia="en-AU"/>
               </w:rPr>
               <w:t>{degreeTitle}</w:t>
+            </w:r>
+          </w:p>
+          <w:p>
+            <w:pPr>
+              <w:rPr>
+                <w:noProof/>
+                <w:lang w:eastAsia="en-AU"/>
+              </w:rPr>
+            </w:pPr>
+            <w:r>
+              <w:rPr>
+                <w:noProof/>
+                <w:lang w:eastAsia="en-AU"/>
+              </w:rPr>
+              <w:t>{degreeType}</w:t>
             </w:r>
           </w:p>
           <w:p>

</xml_diff>

<commit_message>
CV navy template: add ΕΠΑΓΓΕΛΜΑΤΙΚΗ ΕΜΠΕΙΡΙΑ section with experience rows loop
</commit_message>
<xml_diff>
--- a/backend/templates/cv_job_navy_placeholders.docx
+++ b/backend/templates/cv_job_navy_placeholders.docx
@@ -685,6 +685,142 @@
               <w:rPr>
                 <w:noProof/>
                 <w:lang w:val="en-AU" w:eastAsia="en-AU"/>
+              </w:rPr>
+            </w:pPr>
+          </w:p>
+        </w:tc>
+      </w:tr>
+      <w:tr>
+        <w:trPr>
+          <w:trHeight w:val="20"/>
+        </w:trPr>
+        <w:tc>
+          <w:tcPr>
+            <w:tcW w:w="5000" w:type="pct"/>
+            <w:gridSpan w:val="6"/>
+            <w:tcMar>
+              <w:top w:w="0" w:type="dxa"/>
+              <w:left w:w="115" w:type="dxa"/>
+              <w:right w:w="115" w:type="dxa"/>
+            </w:tcMar>
+          </w:tcPr>
+          <w:p>
+            <w:pPr>
+              <w:pStyle w:val="Heading1"/>
+              <w:rPr>
+                <w:lang w:val="el-GR"/>
+              </w:rPr>
+            </w:pPr>
+            <w:r>
+              <w:rPr>
+                <w:lang w:val="el-GR"/>
+              </w:rPr>
+              <w:t xml:space="preserve">ΕΠΑΓΓΕΛΜΑΤΙΚΗ ΕΜΠΕΙΡΙΑ</w:t>
+            </w:r>
+          </w:p>
+          <w:p>
+            <w:pPr>
+              <w:rPr>
+                <w:noProof/>
+                <w:lang w:eastAsia="en-AU"/>
+              </w:rPr>
+            </w:pPr>
+            <w:r>
+              <w:rPr>
+                <w:noProof/>
+                <w:lang w:eastAsia="en-AU"/>
+              </w:rPr>
+              <w:t>{#experienceRows}</w:t>
+            </w:r>
+          </w:p>
+          <w:p>
+            <w:pPr>
+              <w:rPr>
+                <w:b/>
+                <w:bCs/>
+                <w:noProof/>
+                <w:lang w:eastAsia="en-AU"/>
+              </w:rPr>
+            </w:pPr>
+            <w:r>
+              <w:rPr>
+                <w:b/>
+                <w:bCs/>
+                <w:noProof/>
+                <w:lang w:eastAsia="en-AU"/>
+              </w:rPr>
+              <w:t>{employerName}</w:t>
+            </w:r>
+          </w:p>
+          <w:p>
+            <w:pPr>
+              <w:rPr>
+                <w:b/>
+                <w:bCs/>
+                <w:noProof/>
+                <w:lang w:eastAsia="en-AU"/>
+              </w:rPr>
+            </w:pPr>
+            <w:r>
+              <w:rPr>
+                <w:b/>
+                <w:bCs/>
+                <w:noProof/>
+                <w:lang w:eastAsia="en-AU"/>
+              </w:rPr>
+              <w:t>{projectText}</w:t>
+            </w:r>
+          </w:p>
+          <w:p>
+            <w:pPr>
+              <w:rPr>
+                <w:noProof/>
+                <w:lang w:eastAsia="en-AU"/>
+              </w:rPr>
+            </w:pPr>
+            <w:r>
+              <w:rPr>
+                <w:noProof/>
+                <w:lang w:eastAsia="en-AU"/>
+              </w:rPr>
+              <w:t>{roleName}</w:t>
+            </w:r>
+          </w:p>
+          <w:p>
+            <w:pPr>
+              <w:rPr>
+                <w:noProof/>
+                <w:lang w:eastAsia="en-AU"/>
+              </w:rPr>
+            </w:pPr>
+            <w:r>
+              <w:rPr>
+                <w:noProof/>
+                <w:lang w:eastAsia="en-AU"/>
+              </w:rPr>
+              <w:t>{period}</w:t>
+            </w:r>
+          </w:p>
+          <w:p>
+            <w:pPr>
+              <w:rPr>
+                <w:noProof/>
+                <w:lang w:eastAsia="en-AU"/>
+              </w:rPr>
+            </w:pPr>
+            <w:r>
+              <w:rPr>
+                <w:noProof/>
+                <w:lang w:eastAsia="en-AU"/>
+              </w:rPr>
+              <w:t>{/experienceRows}</w:t>
+            </w:r>
+          </w:p>
+          <w:p>
+            <w:pPr>
+              <w:rPr>
+                <w:noProof/>
+                <w:lang w:eastAsia="en-AU"/>
               </w:rPr>
             </w:pPr>
           </w:p>

</xml_diff>

<commit_message>
CV navy: ΕΠΑΓΓΕΛΜΑΤΙΚΗ ΕΜΠΕΙΡΙΑ uses availability periods for CMT rows + history projects only
</commit_message>
<xml_diff>
--- a/backend/templates/cv_job_navy_placeholders.docx
+++ b/backend/templates/cv_job_navy_placeholders.docx
@@ -730,7 +730,7 @@
                 <w:noProof/>
                 <w:lang w:eastAsia="en-AU"/>
               </w:rPr>
-              <w:t>{#experienceRows}</w:t>
+              <w:t>{#workExperienceRows}</w:t>
             </w:r>
           </w:p>
           <w:p>
@@ -813,7 +813,7 @@
                 <w:noProof/>
                 <w:lang w:eastAsia="en-AU"/>
               </w:rPr>
-              <w:t>{/experienceRows}</w:t>
+              <w:t>{/workExperienceRows}</w:t>
             </w:r>
           </w:p>
           <w:p>

</xml_diff>

<commit_message>
CV navy: fix ΔΗΜΟΣΙΕΥΣΕΙΣ section — move heading inside conditional, use publicationsText
</commit_message>
<xml_diff>
--- a/backend/templates/cv_job_navy_placeholders.docx
+++ b/backend/templates/cv_job_navy_placeholders.docx
@@ -1088,27 +1088,37 @@
             </w:tcMar>
           </w:tcPr>
           <w:p>
-            <w:pPr>
-              <w:pStyle w:val="Heading1"/>
-              <w:rPr>
-                <w:lang w:val="el-GR"/>
-              </w:rPr>
-            </w:pPr>
-            <w:r>
-              <w:rPr>
-                <w:lang w:val="el-GR"/>
-              </w:rPr>
-              <w:t>ΔΗΜΟΣΙΕΥΣΕΙς</w:t>
-            </w:r>
-          </w:p>
-          <w:p>
             <w:r>
               <w:t>{#hasPublications}</w:t>
             </w:r>
           </w:p>
           <w:p>
+            <w:pPr>
+              <w:pStyle w:val="Heading1"/>
+              <w:rPr>
+                <w:lang w:val="el-GR"/>
+              </w:rPr>
+            </w:pPr>
             <w:r>
-              <w:t>{#publicationRows}{publicationText}{/publicationRows}</w:t>
+              <w:rPr>
+                <w:lang w:val="el-GR"/>
+              </w:rPr>
+              <w:t>ΔΗΜΟΣΙΕΥΣΕΙς</w:t>
+            </w:r>
+          </w:p>
+          <w:p>
+            <w:pPr>
+              <w:rPr>
+                <w:noProof/>
+                <w:lang w:eastAsia="en-AU"/>
+              </w:rPr>
+            </w:pPr>
+            <w:r>
+              <w:rPr>
+                <w:noProof/>
+                <w:lang w:eastAsia="en-AU"/>
+              </w:rPr>
+              <w:t>{publicationsText}</w:t>
             </w:r>
           </w:p>
           <w:p>

</xml_diff>